<commit_message>
Completa Proceso A Fin
</commit_message>
<xml_diff>
--- a/app/templates/A/fin/A Remito YPFB.docx
+++ b/app/templates/A/fin/A Remito YPFB.docx
@@ -43,7 +43,7 @@
                 <w:highlight w:val="green"/>
                 <w:lang w:val="es-BO"/>
               </w:rPr>
-              <w:t>xxxx</w:t>
+              <w:t xml:space="preserve">{{ current_day }} de {{ current_month }} de {{ current_year }}</w:t>
             </w:r>
             <w:r>
               <w:rPr>
@@ -51,7 +51,7 @@
                 <w:bCs/>
                 <w:lang w:val="es-BO"/>
               </w:rPr>
-              <w:t xml:space="preserve"> </w:t>
+              <w:t xml:space="preserve"/>
             </w:r>
             <w:r>
               <w:rPr>
@@ -59,7 +59,7 @@
                 <w:bCs/>
                 <w:lang w:val="es-BO"/>
               </w:rPr>
-              <w:t xml:space="preserve">de </w:t>
+              <w:t xml:space="preserve"/>
             </w:r>
             <w:r>
               <w:rPr>
@@ -68,7 +68,7 @@
                 <w:highlight w:val="green"/>
                 <w:lang w:val="es-BO"/>
               </w:rPr>
-              <w:t>xxxx</w:t>
+              <w:t xml:space="preserve"/>
             </w:r>
             <w:r>
               <w:rPr>
@@ -76,7 +76,7 @@
                 <w:bCs/>
                 <w:lang w:val="es-BO"/>
               </w:rPr>
-              <w:t xml:space="preserve"> </w:t>
+              <w:t xml:space="preserve"/>
             </w:r>
             <w:r>
               <w:rPr>
@@ -84,7 +84,7 @@
                 <w:bCs/>
                 <w:lang w:val="es-BO"/>
               </w:rPr>
-              <w:t>de 202</w:t>
+              <w:t xml:space="preserve"/>
             </w:r>
             <w:r>
               <w:rPr>
@@ -92,7 +92,7 @@
                 <w:bCs/>
                 <w:lang w:val="es-BO"/>
               </w:rPr>
-              <w:t>6</w:t>
+              <w:t xml:space="preserve"/>
             </w:r>
           </w:p>
         </w:tc>
@@ -122,21 +122,21 @@
                 <w:bCs/>
                 <w:highlight w:val="green"/>
               </w:rPr>
-              <w:t>xxxx</w:t>
+              <w:t xml:space="preserve">{{ cite | e }}/{{ current_year }}</w:t>
             </w:r>
             <w:r>
               <w:rPr>
                 <w:rFonts w:ascii="Trebuchet MS" w:hAnsi="Trebuchet MS" w:cs="Arial"/>
                 <w:bCs/>
               </w:rPr>
-              <w:t>/202</w:t>
+              <w:t xml:space="preserve"/>
             </w:r>
             <w:r>
               <w:rPr>
                 <w:rFonts w:ascii="Trebuchet MS" w:hAnsi="Trebuchet MS" w:cs="Arial"/>
                 <w:bCs/>
               </w:rPr>
-              <w:t>6</w:t>
+              <w:t xml:space="preserve"/>
             </w:r>
           </w:p>
         </w:tc>
@@ -459,7 +459,7 @@
           <w:highlight w:val="green"/>
           <w:lang w:val="es-419"/>
         </w:rPr>
-        <w:t>1000</w:t>
+        <w:t xml:space="preserve">{{ process_number | e }}</w:t>
       </w:r>
       <w:r>
         <w:rPr>
@@ -469,7 +469,7 @@
           <w:highlight w:val="green"/>
           <w:lang w:val="es-419"/>
         </w:rPr>
-        <w:t>xxxx</w:t>
+        <w:t xml:space="preserve"/>
       </w:r>
       <w:r>
         <w:rPr>
@@ -497,7 +497,7 @@
           <w:highlight w:val="green"/>
           <w:lang w:val="es-419"/>
         </w:rPr>
-        <w:t>xxxxxx</w:t>
+        <w:t xml:space="preserve">{{ process_description | e }}</w:t>
       </w:r>
       <w:r>
         <w:rPr>
@@ -639,7 +639,7 @@
           <w:color w:val="000000"/>
           <w:lang w:val="es-BO"/>
         </w:rPr>
-        <w:t xml:space="preserve">Operador del </w:t>
+        <w:t xml:space="preserve">Operador de {{ areas_text | e }}</w:t>
       </w:r>
       <w:r>
         <w:rPr>
@@ -648,7 +648,7 @@
           <w:highlight w:val="green"/>
           <w:lang w:val="es-BO"/>
         </w:rPr>
-        <w:t>Área Bloque San Antonio, Área San Alberto, Área Bloque XX Tarija Oeste</w:t>
+        <w:t xml:space="preserve"/>
       </w:r>
       <w:r>
         <w:rPr>
@@ -657,7 +657,7 @@
           <w:highlight w:val="green"/>
           <w:lang w:val="es-BO"/>
         </w:rPr>
-        <w:t>, Área Colpa y Caranda,</w:t>
+        <w:t xml:space="preserve"/>
       </w:r>
       <w:r>
         <w:rPr>
@@ -666,7 +666,7 @@
           <w:highlight w:val="green"/>
           <w:lang w:val="es-BO"/>
         </w:rPr>
-        <w:t xml:space="preserve"> </w:t>
+        <w:t xml:space="preserve"/>
       </w:r>
       <w:r>
         <w:rPr>
@@ -675,7 +675,7 @@
           <w:highlight w:val="green"/>
           <w:lang w:val="es-BO"/>
         </w:rPr>
-        <w:t>y Área San Telmo Norte</w:t>
+        <w:t xml:space="preserve"/>
       </w:r>
       <w:r>
         <w:rPr>
@@ -692,7 +692,7 @@
           <w:color w:val="000000"/>
           <w:lang w:val="es-BO"/>
         </w:rPr>
-        <w:t>informa que ha realizado el registro de las informaciones y el contrato resultante del proceso de contratación de referencia, mismo que fue autorizado por nota CEAC-</w:t>
+        <w:t xml:space="preserve">informa que ha realizado el registro de las informaciones y el contrato resultante del proceso de contratación de referencia, mismo que fue autorizado por nota {{ authorization_reference | e }}</w:t>
       </w:r>
       <w:r>
         <w:rPr>
@@ -701,7 +701,7 @@
           <w:highlight w:val="green"/>
           <w:lang w:val="es-BO"/>
         </w:rPr>
-        <w:t>xxx</w:t>
+        <w:t xml:space="preserve"/>
       </w:r>
       <w:r>
         <w:rPr>
@@ -710,7 +710,7 @@
           <w:highlight w:val="green"/>
           <w:lang w:val="es-BO"/>
         </w:rPr>
-        <w:t>/2026</w:t>
+        <w:t xml:space="preserve"/>
       </w:r>
       <w:r>
         <w:rPr>
@@ -718,7 +718,7 @@
           <w:color w:val="000000"/>
           <w:lang w:val="es-BO"/>
         </w:rPr>
-        <w:t xml:space="preserve"> conforme a las previsiones de la normativa legal vigente, habiendo sido registrados en el SINCOP N° PEB-A-</w:t>
+        <w:t xml:space="preserve"> conforme a las previsiones de la normativa legal vigente, habiendo sido registrados en el SINCOP N° {{ sincop_registration | e }}</w:t>
       </w:r>
       <w:r>
         <w:rPr>
@@ -727,7 +727,7 @@
           <w:highlight w:val="green"/>
           <w:lang w:val="es-BO"/>
         </w:rPr>
-        <w:t>0</w:t>
+        <w:t xml:space="preserve"/>
       </w:r>
       <w:r>
         <w:rPr>
@@ -736,7 +736,7 @@
           <w:highlight w:val="green"/>
           <w:lang w:val="es-BO"/>
         </w:rPr>
-        <w:t>xx</w:t>
+        <w:t xml:space="preserve"/>
       </w:r>
       <w:r>
         <w:rPr>
@@ -744,7 +744,7 @@
           <w:color w:val="000000"/>
           <w:lang w:val="es-BO"/>
         </w:rPr>
-        <w:t>/</w:t>
+        <w:t xml:space="preserve"/>
       </w:r>
       <w:r>
         <w:rPr>
@@ -753,7 +753,7 @@
           <w:highlight w:val="green"/>
           <w:lang w:val="es-BO"/>
         </w:rPr>
-        <w:t>2026</w:t>
+        <w:t xml:space="preserve"/>
       </w:r>
       <w:r>
         <w:rPr>
@@ -981,51 +981,7 @@
           <w:szCs w:val="14"/>
           <w:lang w:val="es-BO"/>
         </w:rPr>
-        <w:t xml:space="preserve">Adjunto: Anexo 1 Registro Contrato SINCOP </w:t>
-      </w:r>
-      <w:r>
-        <w:rPr>
-          <w:rFonts w:ascii="Trebuchet MS" w:hAnsi="Trebuchet MS" w:cs="Arial"/>
-          <w:bCs/>
-          <w:sz w:val="14"/>
-          <w:szCs w:val="14"/>
-          <w:highlight w:val="green"/>
-          <w:lang w:val="es-BO"/>
-        </w:rPr>
-        <w:t>PEB-A-0</w:t>
-      </w:r>
-      <w:r>
-        <w:rPr>
-          <w:rFonts w:ascii="Trebuchet MS" w:hAnsi="Trebuchet MS" w:cs="Arial"/>
-          <w:bCs/>
-          <w:sz w:val="14"/>
-          <w:szCs w:val="14"/>
-          <w:highlight w:val="green"/>
-          <w:lang w:val="es-BO"/>
-        </w:rPr>
-        <w:t>xx</w:t>
-      </w:r>
-      <w:r>
-        <w:rPr>
-          <w:rFonts w:ascii="Trebuchet MS" w:hAnsi="Trebuchet MS" w:cs="Arial"/>
-          <w:bCs/>
-          <w:sz w:val="14"/>
-          <w:szCs w:val="14"/>
-          <w:highlight w:val="green"/>
-          <w:lang w:val="es-BO"/>
-        </w:rPr>
-        <w:t>/</w:t>
-      </w:r>
-      <w:r>
-        <w:rPr>
-          <w:rFonts w:ascii="Trebuchet MS" w:hAnsi="Trebuchet MS" w:cs="Arial"/>
-          <w:bCs/>
-          <w:sz w:val="14"/>
-          <w:szCs w:val="14"/>
-          <w:highlight w:val="green"/>
-          <w:lang w:val="es-BO"/>
-        </w:rPr>
-        <w:t>xxxx</w:t>
+        <w:t xml:space="preserve">{%p for item in close_attachments %}</w:t>
       </w:r>
     </w:p>
     <w:p>
@@ -1053,9 +1009,18 @@
           <w:szCs w:val="14"/>
           <w:lang w:val="es-BO"/>
         </w:rPr>
-        <w:t xml:space="preserve">              Anexo 2 </w:t>
-      </w:r>
-      <w:r>
+        <w:t xml:space="preserve">{{ 'Adjunto: ' if loop.first else '              ' }}Anexo {{ loop.index }} {{ item | e }}</w:t>
+      </w:r>
+    </w:p>
+    <w:p>
+      <w:pPr>
+        <w:pStyle w:val="Prrafodelista"/>
+        <w:tabs>
+          <w:tab w:val="left" w:pos="1380"/>
+          <w:tab w:val="left" w:pos="1843"/>
+          <w:tab w:val="left" w:pos="2410"/>
+        </w:tabs>
+        <w:ind w:left="2410" w:hanging="2410"/>
         <w:rPr>
           <w:rFonts w:ascii="Trebuchet MS" w:hAnsi="Trebuchet MS" w:cs="Arial"/>
           <w:bCs/>
@@ -1063,8 +1028,7 @@
           <w:szCs w:val="14"/>
           <w:lang w:val="es-BO"/>
         </w:rPr>
-        <w:t>Informe Final</w:t>
-      </w:r>
+      </w:pPr>
       <w:r>
         <w:rPr>
           <w:rFonts w:ascii="Trebuchet MS" w:hAnsi="Trebuchet MS" w:cs="Arial"/>
@@ -1073,93 +1037,7 @@
           <w:szCs w:val="14"/>
           <w:lang w:val="es-BO"/>
         </w:rPr>
-        <w:t xml:space="preserve"> de Contratación</w:t>
-      </w:r>
-    </w:p>
-    <w:p>
-      <w:pPr>
-        <w:pStyle w:val="Prrafodelista"/>
-        <w:tabs>
-          <w:tab w:val="left" w:pos="1380"/>
-          <w:tab w:val="left" w:pos="1843"/>
-          <w:tab w:val="left" w:pos="2410"/>
-        </w:tabs>
-        <w:ind w:left="2410" w:hanging="2410"/>
-        <w:rPr>
-          <w:rFonts w:ascii="Trebuchet MS" w:hAnsi="Trebuchet MS" w:cs="Arial"/>
-          <w:bCs/>
-          <w:sz w:val="14"/>
-          <w:szCs w:val="14"/>
-          <w:lang w:val="es-BO"/>
-        </w:rPr>
-      </w:pPr>
-      <w:r>
-        <w:rPr>
-          <w:rFonts w:ascii="Trebuchet MS" w:hAnsi="Trebuchet MS" w:cs="Arial"/>
-          <w:bCs/>
-          <w:sz w:val="14"/>
-          <w:szCs w:val="14"/>
-          <w:lang w:val="es-BO"/>
-        </w:rPr>
-        <w:t xml:space="preserve">              Anexo 3 </w:t>
-      </w:r>
-      <w:r>
-        <w:rPr>
-          <w:rFonts w:ascii="Trebuchet MS" w:hAnsi="Trebuchet MS" w:cs="Arial"/>
-          <w:bCs/>
-          <w:sz w:val="14"/>
-          <w:szCs w:val="14"/>
-          <w:lang w:val="es-BO"/>
-        </w:rPr>
-        <w:t>Contrato</w:t>
-      </w:r>
-      <w:r>
-        <w:rPr>
-          <w:rFonts w:ascii="Trebuchet MS" w:hAnsi="Trebuchet MS" w:cs="Arial"/>
-          <w:bCs/>
-          <w:sz w:val="14"/>
-          <w:szCs w:val="14"/>
-          <w:lang w:val="es-BO"/>
-        </w:rPr>
-        <w:t xml:space="preserve"> suscrito</w:t>
-      </w:r>
-    </w:p>
-    <w:p>
-      <w:pPr>
-        <w:pStyle w:val="Prrafodelista"/>
-        <w:tabs>
-          <w:tab w:val="left" w:pos="1380"/>
-          <w:tab w:val="left" w:pos="1843"/>
-          <w:tab w:val="left" w:pos="2410"/>
-        </w:tabs>
-        <w:ind w:left="2410" w:hanging="2410"/>
-        <w:rPr>
-          <w:rFonts w:ascii="Trebuchet MS" w:hAnsi="Trebuchet MS" w:cs="Arial"/>
-          <w:bCs/>
-          <w:sz w:val="14"/>
-          <w:szCs w:val="14"/>
-          <w:lang w:val="es-BO"/>
-        </w:rPr>
-      </w:pPr>
-      <w:r>
-        <w:rPr>
-          <w:rFonts w:ascii="Trebuchet MS" w:hAnsi="Trebuchet MS" w:cs="Arial"/>
-          <w:bCs/>
-          <w:sz w:val="14"/>
-          <w:szCs w:val="14"/>
-          <w:lang w:val="es-BO"/>
-        </w:rPr>
-        <w:t xml:space="preserve">              Anexo 4 </w:t>
-      </w:r>
-      <w:r>
-        <w:rPr>
-          <w:rFonts w:ascii="Trebuchet MS" w:hAnsi="Trebuchet MS" w:cs="Arial"/>
-          <w:bCs/>
-          <w:sz w:val="14"/>
-          <w:szCs w:val="14"/>
-          <w:lang w:val="es-BO"/>
-        </w:rPr>
-        <w:t>Circulares</w:t>
+        <w:t xml:space="preserve">{%p endfor %}</w:t>
       </w:r>
     </w:p>
     <w:p>
@@ -1204,7 +1082,7 @@
           <w:highlight w:val="green"/>
           <w:lang w:val="es-BO"/>
         </w:rPr>
-        <w:t>c.c.: TotalEnergies EP Bolivie Sucursal Bolivia</w:t>
+        <w:t xml:space="preserve">{%p for item in cc_companies %}</w:t>
       </w:r>
     </w:p>
     <w:p>
@@ -1231,7 +1109,7 @@
           <w:highlight w:val="green"/>
           <w:lang w:val="es-BO"/>
         </w:rPr>
-        <w:t xml:space="preserve">        YPFB Andina S.A. </w:t>
+        <w:t xml:space="preserve">{{ 'c.c.: ' if loop.first else '        ' }}{{ item | e }}</w:t>
       </w:r>
     </w:p>
     <w:p>
@@ -1258,44 +1136,7 @@
           <w:highlight w:val="green"/>
           <w:lang w:val="es-BO"/>
         </w:rPr>
-        <w:t xml:space="preserve">        YPFB Chaco S.A.</w:t>
-      </w:r>
-    </w:p>
-    <w:p>
-      <w:pPr>
-        <w:autoSpaceDE w:val="0"/>
-        <w:autoSpaceDN w:val="0"/>
-        <w:adjustRightInd w:val="0"/>
-        <w:jc w:val="both"/>
-        <w:rPr>
-          <w:rFonts w:ascii="Trebuchet MS" w:hAnsi="Trebuchet MS" w:cs="Arial"/>
-          <w:color w:val="000000"/>
-          <w:sz w:val="14"/>
-          <w:szCs w:val="14"/>
-          <w:lang w:val="es-BO"/>
-        </w:rPr>
-      </w:pPr>
-      <w:r>
-        <w:rPr>
-          <w:rFonts w:ascii="Trebuchet MS" w:hAnsi="Trebuchet MS" w:cs="Arial"/>
-          <w:color w:val="000000"/>
-          <w:sz w:val="14"/>
-          <w:szCs w:val="14"/>
-          <w:highlight w:val="green"/>
-          <w:lang w:val="es-BO"/>
-        </w:rPr>
-        <w:t xml:space="preserve">        </w:t>
-      </w:r>
-      <w:r>
-        <w:rPr>
-          <w:rFonts w:ascii="Trebuchet MS" w:hAnsi="Trebuchet MS" w:cs="Arial"/>
-          <w:color w:val="000000"/>
-          <w:sz w:val="14"/>
-          <w:szCs w:val="14"/>
-          <w:highlight w:val="green"/>
-          <w:lang w:val="es-BO"/>
-        </w:rPr>
-        <w:t>Shell Bolivia Corporation, Sucursal Bolivia</w:t>
+        <w:t xml:space="preserve">{%p endfor %}</w:t>
       </w:r>
     </w:p>
     <w:sectPr>

</xml_diff>

<commit_message>
Actualiza Proceso A y prepara Proceso B con extractor SIC
</commit_message>
<xml_diff>
--- a/app/templates/A/fin/A Remito YPFB.docx
+++ b/app/templates/A/fin/A Remito YPFB.docx
@@ -40,7 +40,6 @@
               <w:rPr>
                 <w:rFonts w:ascii="Trebuchet MS" w:hAnsi="Trebuchet MS" w:cs="Arial"/>
                 <w:bCs/>
-                <w:highlight w:val="green"/>
                 <w:lang w:val="es-BO"/>
               </w:rPr>
               <w:t xml:space="preserve">{{ current_day }} de {{ current_month }} de {{ current_year }}</w:t>
@@ -65,7 +64,6 @@
               <w:rPr>
                 <w:rFonts w:ascii="Trebuchet MS" w:hAnsi="Trebuchet MS" w:cs="Arial"/>
                 <w:bCs/>
-                <w:highlight w:val="green"/>
                 <w:lang w:val="es-BO"/>
               </w:rPr>
               <w:t xml:space="preserve"/>
@@ -114,15 +112,14 @@
                 <w:rFonts w:ascii="Trebuchet MS" w:hAnsi="Trebuchet MS" w:cs="Arial"/>
                 <w:bCs/>
               </w:rPr>
-              <w:t xml:space="preserve">PEB/CORP/CBS </w:t>
+              <w:t xml:space="preserve">{{ full_cite }}</w:t>
             </w:r>
             <w:r>
               <w:rPr>
                 <w:rFonts w:ascii="Trebuchet MS" w:hAnsi="Trebuchet MS" w:cs="Arial"/>
                 <w:bCs/>
-                <w:highlight w:val="green"/>
               </w:rPr>
-              <w:t xml:space="preserve">{{ cite | e }}/{{ current_year }}</w:t>
+              <w:t xml:space="preserve"/>
             </w:r>
             <w:r>
               <w:rPr>
@@ -456,20 +453,9 @@
           <w:rFonts w:ascii="Trebuchet MS" w:hAnsi="Trebuchet MS" w:cs="Arial"/>
           <w:b/>
           <w:bCs/>
-          <w:highlight w:val="green"/>
           <w:lang w:val="es-419"/>
         </w:rPr>
         <w:t xml:space="preserve">{{ process_number | e }}</w:t>
-      </w:r>
-      <w:r>
-        <w:rPr>
-          <w:rFonts w:ascii="Trebuchet MS" w:hAnsi="Trebuchet MS" w:cs="Arial"/>
-          <w:b/>
-          <w:bCs/>
-          <w:highlight w:val="green"/>
-          <w:lang w:val="es-419"/>
-        </w:rPr>
-        <w:t xml:space="preserve"/>
       </w:r>
       <w:r>
         <w:rPr>
@@ -478,7 +464,7 @@
           <w:bCs/>
           <w:lang w:val="es-419"/>
         </w:rPr>
-        <w:t> </w:t>
+        <w:t xml:space="preserve"/>
       </w:r>
       <w:r>
         <w:rPr>
@@ -487,14 +473,22 @@
           <w:bCs/>
           <w:lang w:val="es-419"/>
         </w:rPr>
-        <w:t>- </w:t>
+        <w:t> </w:t>
       </w:r>
       <w:r>
         <w:rPr>
           <w:rFonts w:ascii="Trebuchet MS" w:hAnsi="Trebuchet MS" w:cs="Arial"/>
           <w:b/>
           <w:bCs/>
-          <w:highlight w:val="green"/>
+          <w:lang w:val="es-419"/>
+        </w:rPr>
+        <w:t>- </w:t>
+      </w:r>
+      <w:r>
+        <w:rPr>
+          <w:rFonts w:ascii="Trebuchet MS" w:hAnsi="Trebuchet MS" w:cs="Arial"/>
+          <w:b/>
+          <w:bCs/>
           <w:lang w:val="es-419"/>
         </w:rPr>
         <w:t xml:space="preserve">{{ process_description | e }}</w:t>
@@ -645,34 +639,6 @@
         <w:rPr>
           <w:rFonts w:ascii="Trebuchet MS" w:hAnsi="Trebuchet MS" w:cs="Arial"/>
           <w:color w:val="000000"/>
-          <w:highlight w:val="green"/>
-          <w:lang w:val="es-BO"/>
-        </w:rPr>
-        <w:t xml:space="preserve"/>
-      </w:r>
-      <w:r>
-        <w:rPr>
-          <w:rFonts w:ascii="Trebuchet MS" w:hAnsi="Trebuchet MS" w:cs="Arial"/>
-          <w:color w:val="000000"/>
-          <w:highlight w:val="green"/>
-          <w:lang w:val="es-BO"/>
-        </w:rPr>
-        <w:t xml:space="preserve"/>
-      </w:r>
-      <w:r>
-        <w:rPr>
-          <w:rFonts w:ascii="Trebuchet MS" w:hAnsi="Trebuchet MS" w:cs="Arial"/>
-          <w:color w:val="000000"/>
-          <w:highlight w:val="green"/>
-          <w:lang w:val="es-BO"/>
-        </w:rPr>
-        <w:t xml:space="preserve"/>
-      </w:r>
-      <w:r>
-        <w:rPr>
-          <w:rFonts w:ascii="Trebuchet MS" w:hAnsi="Trebuchet MS" w:cs="Arial"/>
-          <w:color w:val="000000"/>
-          <w:highlight w:val="green"/>
           <w:lang w:val="es-BO"/>
         </w:rPr>
         <w:t xml:space="preserve"/>
@@ -683,33 +649,14 @@
           <w:color w:val="000000"/>
           <w:lang w:val="es-BO"/>
         </w:rPr>
-        <w:t xml:space="preserve">, </w:t>
-      </w:r>
-      <w:bookmarkEnd w:id="1"/>
+        <w:t xml:space="preserve"/>
+      </w:r>
       <w:r>
         <w:rPr>
           <w:rFonts w:ascii="Trebuchet MS" w:hAnsi="Trebuchet MS" w:cs="Arial"/>
           <w:color w:val="000000"/>
           <w:lang w:val="es-BO"/>
         </w:rPr>
-        <w:t xml:space="preserve">informa que ha realizado el registro de las informaciones y el contrato resultante del proceso de contratación de referencia, mismo que fue autorizado por nota {{ authorization_reference | e }}</w:t>
-      </w:r>
-      <w:r>
-        <w:rPr>
-          <w:rFonts w:ascii="Trebuchet MS" w:hAnsi="Trebuchet MS" w:cs="Arial"/>
-          <w:color w:val="000000"/>
-          <w:highlight w:val="green"/>
-          <w:lang w:val="es-BO"/>
-        </w:rPr>
-        <w:t xml:space="preserve"/>
-      </w:r>
-      <w:r>
-        <w:rPr>
-          <w:rFonts w:ascii="Trebuchet MS" w:hAnsi="Trebuchet MS" w:cs="Arial"/>
-          <w:color w:val="000000"/>
-          <w:highlight w:val="green"/>
-          <w:lang w:val="es-BO"/>
-        </w:rPr>
         <w:t xml:space="preserve"/>
       </w:r>
       <w:r>
@@ -718,24 +665,6 @@
           <w:color w:val="000000"/>
           <w:lang w:val="es-BO"/>
         </w:rPr>
-        <w:t xml:space="preserve"> conforme a las previsiones de la normativa legal vigente, habiendo sido registrados en el SINCOP N° {{ sincop_registration | e }}</w:t>
-      </w:r>
-      <w:r>
-        <w:rPr>
-          <w:rFonts w:ascii="Trebuchet MS" w:hAnsi="Trebuchet MS" w:cs="Arial"/>
-          <w:color w:val="000000"/>
-          <w:highlight w:val="green"/>
-          <w:lang w:val="es-BO"/>
-        </w:rPr>
-        <w:t xml:space="preserve"/>
-      </w:r>
-      <w:r>
-        <w:rPr>
-          <w:rFonts w:ascii="Trebuchet MS" w:hAnsi="Trebuchet MS" w:cs="Arial"/>
-          <w:color w:val="000000"/>
-          <w:highlight w:val="green"/>
-          <w:lang w:val="es-BO"/>
-        </w:rPr>
         <w:t xml:space="preserve"/>
       </w:r>
       <w:r>
@@ -744,13 +673,69 @@
           <w:color w:val="000000"/>
           <w:lang w:val="es-BO"/>
         </w:rPr>
+        <w:t xml:space="preserve">, </w:t>
+      </w:r>
+      <w:bookmarkEnd w:id="1"/>
+      <w:r>
+        <w:rPr>
+          <w:rFonts w:ascii="Trebuchet MS" w:hAnsi="Trebuchet MS" w:cs="Arial"/>
+          <w:color w:val="000000"/>
+          <w:lang w:val="es-BO"/>
+        </w:rPr>
+        <w:t xml:space="preserve">informa que ha realizado el registro de las informaciones y el contrato resultante del proceso de contratación de referencia, mismo que fue autorizado por nota {{ authorization_reference | e }}</w:t>
+      </w:r>
+      <w:r>
+        <w:rPr>
+          <w:rFonts w:ascii="Trebuchet MS" w:hAnsi="Trebuchet MS" w:cs="Arial"/>
+          <w:color w:val="000000"/>
+          <w:lang w:val="es-BO"/>
+        </w:rPr>
         <w:t xml:space="preserve"/>
       </w:r>
       <w:r>
         <w:rPr>
           <w:rFonts w:ascii="Trebuchet MS" w:hAnsi="Trebuchet MS" w:cs="Arial"/>
           <w:color w:val="000000"/>
-          <w:highlight w:val="green"/>
+          <w:lang w:val="es-BO"/>
+        </w:rPr>
+        <w:t xml:space="preserve"/>
+      </w:r>
+      <w:r>
+        <w:rPr>
+          <w:rFonts w:ascii="Trebuchet MS" w:hAnsi="Trebuchet MS" w:cs="Arial"/>
+          <w:color w:val="000000"/>
+          <w:lang w:val="es-BO"/>
+        </w:rPr>
+        <w:t xml:space="preserve"> conforme a las previsiones de la normativa legal vigente, habiendo sido registrados en el SINCOP N° {{ sincop_registration | e }}</w:t>
+      </w:r>
+      <w:r>
+        <w:rPr>
+          <w:rFonts w:ascii="Trebuchet MS" w:hAnsi="Trebuchet MS" w:cs="Arial"/>
+          <w:color w:val="000000"/>
+          <w:lang w:val="es-BO"/>
+        </w:rPr>
+        <w:t xml:space="preserve"/>
+      </w:r>
+      <w:r>
+        <w:rPr>
+          <w:rFonts w:ascii="Trebuchet MS" w:hAnsi="Trebuchet MS" w:cs="Arial"/>
+          <w:color w:val="000000"/>
+          <w:lang w:val="es-BO"/>
+        </w:rPr>
+        <w:t xml:space="preserve"/>
+      </w:r>
+      <w:r>
+        <w:rPr>
+          <w:rFonts w:ascii="Trebuchet MS" w:hAnsi="Trebuchet MS" w:cs="Arial"/>
+          <w:color w:val="000000"/>
+          <w:lang w:val="es-BO"/>
+        </w:rPr>
+        <w:t xml:space="preserve"/>
+      </w:r>
+      <w:r>
+        <w:rPr>
+          <w:rFonts w:ascii="Trebuchet MS" w:hAnsi="Trebuchet MS" w:cs="Arial"/>
+          <w:color w:val="000000"/>
           <w:lang w:val="es-BO"/>
         </w:rPr>
         <w:t xml:space="preserve"/>
@@ -951,7 +936,6 @@
           <w:b/>
           <w:sz w:val="16"/>
           <w:szCs w:val="16"/>
-          <w:highlight w:val="green"/>
           <w:lang w:val="es-BO"/>
         </w:rPr>
       </w:pPr>
@@ -1069,7 +1053,6 @@
           <w:color w:val="000000"/>
           <w:sz w:val="14"/>
           <w:szCs w:val="14"/>
-          <w:highlight w:val="green"/>
           <w:lang w:val="es-BO"/>
         </w:rPr>
       </w:pPr>
@@ -1079,7 +1062,6 @@
           <w:color w:val="000000"/>
           <w:sz w:val="14"/>
           <w:szCs w:val="14"/>
-          <w:highlight w:val="green"/>
           <w:lang w:val="es-BO"/>
         </w:rPr>
         <w:t xml:space="preserve">{%p for item in cc_companies %}</w:t>
@@ -1096,7 +1078,6 @@
           <w:color w:val="000000"/>
           <w:sz w:val="14"/>
           <w:szCs w:val="14"/>
-          <w:highlight w:val="green"/>
           <w:lang w:val="es-BO"/>
         </w:rPr>
       </w:pPr>
@@ -1106,7 +1087,6 @@
           <w:color w:val="000000"/>
           <w:sz w:val="14"/>
           <w:szCs w:val="14"/>
-          <w:highlight w:val="green"/>
           <w:lang w:val="es-BO"/>
         </w:rPr>
         <w:t xml:space="preserve">{{ 'c.c.: ' if loop.first else '        ' }}{{ item | e }}</w:t>
@@ -1123,7 +1103,6 @@
           <w:color w:val="000000"/>
           <w:sz w:val="14"/>
           <w:szCs w:val="14"/>
-          <w:highlight w:val="green"/>
           <w:lang w:val="es-BO"/>
         </w:rPr>
       </w:pPr>
@@ -1133,7 +1112,6 @@
           <w:color w:val="000000"/>
           <w:sz w:val="14"/>
           <w:szCs w:val="14"/>
-          <w:highlight w:val="green"/>
           <w:lang w:val="es-BO"/>
         </w:rPr>
         <w:t xml:space="preserve">{%p endfor %}</w:t>

</xml_diff>